<commit_message>
Add in-class problem set 4 (Case 7); problem sets 3-4: Part II also submits the AI transcript
Co-Authored-By: Claude Opus 5.5 <noreply@anthropic.com>
</commit_message>
<xml_diff>
--- a/cases/case4_panel_badge/In PS 3.docx
+++ b/cases/case4_panel_badge/In PS 3.docx
@@ -72,7 +72,13 @@
       </w:r>
       <w:proofErr w:type="spellEnd"/>
       <w:r>
-        <w:t xml:space="preserve">/492-coding), notebook case4_part1.ipynb. </w:t>
+        <w:t xml:space="preserve">/492-coding), notebook </w:t>
+      </w:r>
+      <w:r>
+        <w:t>PS3_</w:t>
+      </w:r>
+      <w:r>
+        <w:t xml:space="preserve">case4_part1.ipynb. </w:t>
       </w:r>
       <w:proofErr w:type="spellStart"/>
       <w:r>
@@ -617,7 +623,13 @@
     <w:p/>
     <w:p>
       <w:r>
-        <w:t xml:space="preserve">Open case4_part2.ipynb. It begins with an email from </w:t>
+        <w:t xml:space="preserve">Open </w:t>
+      </w:r>
+      <w:r>
+        <w:t>PS3_</w:t>
+      </w:r>
+      <w:r>
+        <w:t xml:space="preserve">case4_part2.ipynb. It begins with an email from </w:t>
       </w:r>
       <w:proofErr w:type="spellStart"/>
       <w:r>
@@ -642,7 +654,52 @@
         <w:t>9</w:t>
       </w:r>
       <w:r>
-        <w:t xml:space="preserve"> in the templates below, submit your own decision on the Google form (your name as the team, case = 4, round = 2), and upload your own Part II notebook to Canvas.</w:t>
+        <w:t xml:space="preserve"> in the templates below, submit your own decision on the Google form (your name as the team, case = 4, round = 2), and </w:t>
+      </w:r>
+      <w:r>
+        <w:rPr>
+          <w:b/>
+          <w:bCs/>
+        </w:rPr>
+        <w:t>s</w:t>
+      </w:r>
+      <w:r>
+        <w:rPr>
+          <w:b/>
+          <w:bCs/>
+        </w:rPr>
+        <w:t xml:space="preserve">ubmit one zip file containing two documents: your </w:t>
+      </w:r>
+      <w:r>
+        <w:rPr>
+          <w:b/>
+          <w:bCs/>
+        </w:rPr>
+        <w:t xml:space="preserve">own Part II </w:t>
+      </w:r>
+      <w:proofErr w:type="spellStart"/>
+      <w:r>
+        <w:rPr>
+          <w:b/>
+          <w:bCs/>
+        </w:rPr>
+        <w:t>ipynb</w:t>
+      </w:r>
+      <w:proofErr w:type="spellEnd"/>
+      <w:r>
+        <w:rPr>
+          <w:b/>
+          <w:bCs/>
+        </w:rPr>
+        <w:t xml:space="preserve"> and your AI transcript with a signed statement</w:t>
+      </w:r>
+      <w:r>
+        <w:t>.</w:t>
+      </w:r>
+    </w:p>
+    <w:p>
+      <w:r>
+        <w:t>AI transcript with a signed statement: the complete conversation from every AI tool you used, as a share link or a full export (not screenshots or excerpts), and a signed statement that it is complete. If you used no AI tool, submit only the signed statement saying so. The AI submission is not graded and only used for assessing learning.</w:t>
       </w:r>
     </w:p>
     <w:p>
@@ -864,6 +921,7 @@
           </w:tcPr>
           <w:p>
             <w:r>
+              <w:lastRenderedPageBreak/>
               <w:t>Fixed-effects badge effect on revenue (%)</w:t>
             </w:r>
           </w:p>
@@ -907,7 +965,6 @@
           </w:tcPr>
           <w:p>
             <w:r>
-              <w:lastRenderedPageBreak/>
               <w:t>Trend before the badge, and what it would mean</w:t>
             </w:r>
           </w:p>

</xml_diff>

<commit_message>
Problem sets 3-4: no Google form submission for Part II
Co-Authored-By: Claude Opus 5.5 <noreply@anthropic.com>
</commit_message>
<xml_diff>
--- a/cases/case4_panel_badge/In PS 3.docx
+++ b/cases/case4_panel_badge/In PS 3.docx
@@ -654,7 +654,7 @@
         <w:t>9</w:t>
       </w:r>
       <w:r>
-        <w:t xml:space="preserve"> in the templates below, submit your own decision on the Google form (your name as the team, case = 4, round = 2), and </w:t>
+        <w:t xml:space="preserve"> in the notebook, and </w:t>
       </w:r>
       <w:r>
         <w:rPr>
@@ -694,7 +694,7 @@
         <w:t xml:space="preserve"> and your AI transcript with a signed statement</w:t>
       </w:r>
       <w:r>
-        <w:t>.</w:t>
+        <w:t>. Do not submit your Part II decision on the Google form.</w:t>
       </w:r>
     </w:p>
     <w:p>

</xml_diff>